<commit_message>
GUIDES-T46-T50: align Book Return guides to final T01-T60 training data [skip guides]
</commit_message>
<xml_diff>
--- a/Documents/Student-Guides/Book-Return/T46_Create_Book_Return/T46_01_Initial_API_Contract.docx
+++ b/Documents/Student-Guides/Book-Return/T46_Create_Book_Return/T46_01_Initial_API_Contract.docx
@@ -550,7 +550,29 @@
           </w:tcPr>
           <w:p>
             <w:r>
-              <w:t>COMPLETED; no Fine</w:t>
+              <w:t>COMPLETED; FINE-0003 OUTSTANDING</w:t>
+            </w:r>
+          </w:p>
+        </w:tc>
+      </w:tr>
+      <w:tr>
+        <w:tc>
+          <w:tcPr>
+            <w:tcW w:type="dxa" w:w="5083"/>
+          </w:tcPr>
+          <w:p>
+            <w:r>
+              <w:t>RET-0004</w:t>
+            </w:r>
+          </w:p>
+        </w:tc>
+        <w:tc>
+          <w:tcPr>
+            <w:tcW w:type="dxa" w:w="5083"/>
+          </w:tcPr>
+          <w:p>
+            <w:r>
+              <w:t>COMPLETED; no Fine - T49 successful Void case</w:t>
             </w:r>
           </w:p>
         </w:tc>

</xml_diff>